<commit_message>
itinerario UD4 abril terminado
</commit_message>
<xml_diff>
--- a/Asignaturas 2/Programación Multimedia y Dispositivos Móviles/UD3/Caso_Practico_1/Muñoz_de_la_Sierra_Alejandro_Programacion_Multimedia_UD3_Caso_Practico_1.docx
+++ b/Asignaturas 2/Programación Multimedia y Dispositivos Móviles/UD3/Caso_Practico_1/Muñoz_de_la_Sierra_Alejandro_Programacion_Multimedia_UD3_Caso_Practico_1.docx
@@ -69,18 +69,16 @@
               </w:sdtPr>
               <w:sdtContent>
                 <w:r>
-                  <w:t xml:space="preserve">TAREA </w:t>
+                  <w:t>CASO PRACTICO</w:t>
                 </w:r>
-                <w:proofErr w:type="gramStart"/>
                 <w:r>
-                  <w:t>1</w:t>
+                  <w:t xml:space="preserve"> 1</w:t>
                 </w:r>
                 <w:r>
                   <w:t xml:space="preserve">  UD</w:t>
                 </w:r>
-                <w:proofErr w:type="gramEnd"/>
                 <w:r>
-                  <w:t>2</w:t>
+                  <w:t>3</w:t>
                 </w:r>
               </w:sdtContent>
             </w:sdt>
@@ -3088,29 +3086,7 @@
           <w:szCs w:val="28"/>
           <w:lang w:val="es-ES"/>
         </w:rPr>
-        <w:t xml:space="preserve">empaquetar </w:t>
-      </w:r>
-      <w:proofErr w:type="spellStart"/>
-      <w:r>
-        <w:rPr>
-          <w:rFonts w:cstheme="minorHAnsi"/>
-          <w:b/>
-          <w:bCs/>
-          <w:szCs w:val="28"/>
-          <w:lang w:val="es-ES"/>
-        </w:rPr>
-        <w:t>el</w:t>
-      </w:r>
-      <w:proofErr w:type="spellEnd"/>
-      <w:r>
-        <w:rPr>
-          <w:rFonts w:cstheme="minorHAnsi"/>
-          <w:b/>
-          <w:bCs/>
-          <w:szCs w:val="28"/>
-          <w:lang w:val="es-ES"/>
-        </w:rPr>
-        <w:t xml:space="preserve"> .mp3</w:t>
+        <w:t>empaquetar el .mp3</w:t>
       </w:r>
       <w:r>
         <w:rPr>
@@ -3441,25 +3417,7 @@
           <w:szCs w:val="28"/>
           <w:lang w:val="es-ES"/>
         </w:rPr>
-        <w:t>/</w:t>
-      </w:r>
-      <w:proofErr w:type="spellStart"/>
-      <w:r>
-        <w:rPr>
-          <w:rFonts w:cstheme="minorHAnsi"/>
-          <w:szCs w:val="28"/>
-          <w:lang w:val="es-ES"/>
-        </w:rPr>
-        <w:t>res</w:t>
-      </w:r>
-      <w:proofErr w:type="spellEnd"/>
-      <w:r>
-        <w:rPr>
-          <w:rFonts w:cstheme="minorHAnsi"/>
-          <w:szCs w:val="28"/>
-          <w:lang w:val="es-ES"/>
-        </w:rPr>
-        <w:t xml:space="preserve">/raw/), </w:t>
+        <w:t xml:space="preserve">/res/raw/), </w:t>
       </w:r>
       <w:r>
         <w:rPr>
@@ -7926,15 +7884,7 @@
           <w:szCs w:val="28"/>
           <w:lang w:val="es-ES"/>
         </w:rPr>
-        <w:t>El paquete es el mismo al igual que las importaciones.</w:t>
-      </w:r>
-      <w:r>
-        <w:rPr>
-          <w:rFonts w:cstheme="minorHAnsi"/>
-          <w:szCs w:val="28"/>
-          <w:lang w:val="es-ES"/>
-        </w:rPr>
-        <w:t xml:space="preserve"> El código empieza a añadirse a partir de la declaración de variables. </w:t>
+        <w:t xml:space="preserve">El paquete es el mismo al igual que las importaciones. El código empieza a añadirse a partir de la declaración de variables. </w:t>
       </w:r>
       <w:r>
         <w:rPr>
@@ -8066,6 +8016,7 @@
       <w:r>
         <w:rPr>
           <w:rFonts w:cstheme="minorHAnsi"/>
+          <w:noProof/>
           <w:szCs w:val="28"/>
           <w:lang w:val="es-ES"/>
         </w:rPr>
@@ -8454,6 +8405,7 @@
       <w:r>
         <w:rPr>
           <w:rFonts w:cstheme="minorHAnsi"/>
+          <w:noProof/>
           <w:szCs w:val="28"/>
           <w:lang w:val="es-ES"/>
         </w:rPr>
@@ -8519,6 +8471,7 @@
       <w:r>
         <w:rPr>
           <w:rFonts w:cstheme="minorHAnsi"/>
+          <w:noProof/>
           <w:szCs w:val="28"/>
           <w:lang w:val="es-ES"/>
         </w:rPr>
@@ -9082,6 +9035,7 @@
       <w:r>
         <w:rPr>
           <w:rFonts w:cstheme="minorHAnsi"/>
+          <w:noProof/>
           <w:szCs w:val="28"/>
           <w:lang w:val="es-ES"/>
         </w:rPr>
@@ -9432,6 +9386,7 @@
       <w:r>
         <w:rPr>
           <w:rFonts w:cstheme="minorHAnsi"/>
+          <w:noProof/>
           <w:szCs w:val="28"/>
           <w:lang w:val="es-ES"/>
         </w:rPr>
@@ -9922,6 +9877,7 @@
       <w:r>
         <w:rPr>
           <w:rFonts w:cstheme="minorHAnsi"/>
+          <w:noProof/>
           <w:szCs w:val="28"/>
           <w:lang w:val="es-ES"/>
         </w:rPr>
@@ -10413,6 +10369,7 @@
       <w:r>
         <w:rPr>
           <w:rFonts w:cstheme="minorHAnsi"/>
+          <w:noProof/>
           <w:szCs w:val="28"/>
           <w:lang w:val="es-ES"/>
         </w:rPr>
@@ -10487,6 +10444,7 @@
       <w:r>
         <w:rPr>
           <w:rFonts w:cstheme="minorHAnsi"/>
+          <w:noProof/>
           <w:szCs w:val="28"/>
           <w:lang w:val="es-ES"/>
         </w:rPr>
@@ -10534,6 +10492,7 @@
       <w:r>
         <w:rPr>
           <w:rFonts w:cstheme="minorHAnsi"/>
+          <w:noProof/>
           <w:szCs w:val="28"/>
           <w:lang w:val="es-ES"/>
         </w:rPr>
@@ -10622,6 +10581,7 @@
       <w:r>
         <w:rPr>
           <w:rFonts w:cstheme="minorHAnsi"/>
+          <w:noProof/>
           <w:szCs w:val="28"/>
           <w:lang w:val="es-ES"/>
         </w:rPr>
@@ -14411,6 +14371,7 @@
   <w:style w:type="character" w:default="1" w:styleId="Fuentedeprrafopredeter">
     <w:name w:val="Default Paragraph Font"/>
     <w:uiPriority w:val="1"/>
+    <w:semiHidden/>
     <w:unhideWhenUsed/>
   </w:style>
   <w:style w:type="table" w:default="1" w:styleId="Tablanormal">
@@ -15532,6 +15493,7 @@
     <w:rsid w:val="00454BCD"/>
     <w:rsid w:val="00495E43"/>
     <w:rsid w:val="004A476C"/>
+    <w:rsid w:val="004D4B23"/>
     <w:rsid w:val="004F2859"/>
     <w:rsid w:val="005A1426"/>
     <w:rsid w:val="005B1A24"/>
@@ -15572,6 +15534,7 @@
     <w:rsid w:val="00B44AFF"/>
     <w:rsid w:val="00C005BF"/>
     <w:rsid w:val="00C4778A"/>
+    <w:rsid w:val="00D542E5"/>
     <w:rsid w:val="00D9438F"/>
     <w:rsid w:val="00DC23B0"/>
     <w:rsid w:val="00E456A4"/>
@@ -16329,15 +16292,6 @@
 </file>
 
 <file path=customXml/item1.xml><?xml version="1.0" encoding="utf-8"?>
-<?mso-contentType ?>
-<FormTemplates xmlns="http://schemas.microsoft.com/sharepoint/v3/contenttype/forms">
-  <Display>DocumentLibraryForm</Display>
-  <Edit>DocumentLibraryForm</Edit>
-  <New>DocumentLibraryForm</New>
-</FormTemplates>
-</file>
-
-<file path=customXml/item2.xml><?xml version="1.0" encoding="utf-8"?>
 <p:properties xmlns:p="http://schemas.microsoft.com/office/2006/metadata/properties" xmlns:xsi="http://www.w3.org/2001/XMLSchema-instance" xmlns:pc="http://schemas.microsoft.com/office/infopath/2007/PartnerControls">
   <documentManagement>
     <_ip_UnifiedCompliancePolicyUIAction xmlns="http://schemas.microsoft.com/sharepoint/v3" xsi:nil="true"/>
@@ -16357,8 +16311,17 @@
 </p:properties>
 </file>
 
+<file path=customXml/item2.xml><?xml version="1.0" encoding="utf-8"?>
+<b:Sources xmlns:b="http://schemas.openxmlformats.org/officeDocument/2006/bibliography" xmlns="http://schemas.openxmlformats.org/officeDocument/2006/bibliography" SelectedStyle="\APASixthEditionOfficeOnline.xsl" StyleName="APA" Version="6"/>
+</file>
+
 <file path=customXml/item3.xml><?xml version="1.0" encoding="utf-8"?>
-<b:Sources xmlns:b="http://schemas.openxmlformats.org/officeDocument/2006/bibliography" xmlns="http://schemas.openxmlformats.org/officeDocument/2006/bibliography" SelectedStyle="\APASixthEditionOfficeOnline.xsl" StyleName="APA" Version="6"/>
+<?mso-contentType ?>
+<FormTemplates xmlns="http://schemas.microsoft.com/sharepoint/v3/contenttype/forms">
+  <Display>DocumentLibraryForm</Display>
+  <Edit>DocumentLibraryForm</Edit>
+  <New>DocumentLibraryForm</New>
+</FormTemplates>
 </file>
 
 <file path=customXml/item4.xml><?xml version="1.0" encoding="utf-8"?>
@@ -16674,14 +16637,6 @@
 </file>
 
 <file path=customXml/itemProps1.xml><?xml version="1.0" encoding="utf-8"?>
-<ds:datastoreItem xmlns:ds="http://schemas.openxmlformats.org/officeDocument/2006/customXml" ds:itemID="{57C77F9C-8BCF-4692-B2E4-26011E2A55B4}">
-  <ds:schemaRefs>
-    <ds:schemaRef ds:uri="http://schemas.microsoft.com/sharepoint/v3/contenttype/forms"/>
-  </ds:schemaRefs>
-</ds:datastoreItem>
-</file>
-
-<file path=customXml/itemProps2.xml><?xml version="1.0" encoding="utf-8"?>
 <ds:datastoreItem xmlns:ds="http://schemas.openxmlformats.org/officeDocument/2006/customXml" ds:itemID="{8DE4806E-889F-44E5-89CE-8DBA0CB694CA}">
   <ds:schemaRefs>
     <ds:schemaRef ds:uri="http://schemas.microsoft.com/office/2006/metadata/properties"/>
@@ -16693,10 +16648,18 @@
 </ds:datastoreItem>
 </file>
 
-<file path=customXml/itemProps3.xml><?xml version="1.0" encoding="utf-8"?>
+<file path=customXml/itemProps2.xml><?xml version="1.0" encoding="utf-8"?>
 <ds:datastoreItem xmlns:ds="http://schemas.openxmlformats.org/officeDocument/2006/customXml" ds:itemID="{E4E10AD3-AD8B-4B56-B640-42AEB6EC784A}">
   <ds:schemaRefs>
     <ds:schemaRef ds:uri="http://schemas.openxmlformats.org/officeDocument/2006/bibliography"/>
+  </ds:schemaRefs>
+</ds:datastoreItem>
+</file>
+
+<file path=customXml/itemProps3.xml><?xml version="1.0" encoding="utf-8"?>
+<ds:datastoreItem xmlns:ds="http://schemas.openxmlformats.org/officeDocument/2006/customXml" ds:itemID="{57C77F9C-8BCF-4692-B2E4-26011E2A55B4}">
+  <ds:schemaRefs>
+    <ds:schemaRef ds:uri="http://schemas.microsoft.com/sharepoint/v3/contenttype/forms"/>
   </ds:schemaRefs>
 </ds:datastoreItem>
 </file>

</xml_diff>